<commit_message>
final polish: citation style, NEON expansion, docx author metadata
Co-Authored-By: Claude Fable 5.1 <noreply@anthropic.com>
</commit_message>
<xml_diff>
--- a/paper/draft_modis.docx
+++ b/paper/draft_modis.docx
@@ -167,7 +167,7 @@
         <w:pStyle w:val="BodyText"/>
       </w:pPr>
       <w:r>
-        <w:t xml:space="preserve">These changes are now well documented at continental scales. Over recent decades, researchers have observed meaningful trends for each component of the water budget. Temperatures are increasing across most of the CONUS, increasing evaporation (Ji et al, 2014). Precipitation has become more variable, with more of it arriving in extreme events (Adler et al, 2017; Davenport et al, 2021). Concurrently, productivity from watersheds has been increasing across most of the CONUS (Zeng et al, 2018; Wang et al, 2021; Yang et al, 2023). Research also shows that the increasing water use efficiency (WUE) of those plants from carbon fertilization has leveled off, leading to increased transpiration as temperatures continue to rise (Li et al, 2023). These concurrent shifts in the water balance have prompted a broader reckoning: the long-held assumption that hydrologic systems fluctuate within a stationary envelope may no longer hold (Milly et al., 2008). If stationarity cannot be assumed, detecting and characterizing streamflow trends becomes essential.</w:t>
+        <w:t xml:space="preserve">These changes are now well documented at continental scales. Over recent decades, researchers have observed meaningful trends for each component of the water budget. Temperatures are increasing across most of the CONUS, increasing evaporation (Ji et al, 2014). Precipitation has become more variable, with more of it arriving in extreme events (Adler et al, 2017; Davenport et al, 2021). Concurrently, productivity from watersheds has been increasing across most of the CONUS (Zeng et al, 2018; Wang et al, 2021; Yang et al, 2023). Research also shows that the increasing water use efficiency (WUE) of those plants from carbon fertilization has leveled off, leading to increased transpiration as temperatures continue to rise (Li et al, 2023). These concurrent shifts in the water balance have prompted a broader reckoning: the long-held assumption that hydrologic systems fluctuate within a stationary envelope may no longer hold (Milly et al, 2008). If stationarity cannot be assumed, detecting and characterizing streamflow trends becomes essential.</w:t>
       </w:r>
     </w:p>
     <w:p>
@@ -662,7 +662,7 @@
         <w:pStyle w:val="BodyText"/>
       </w:pPr>
       <w:r>
-        <w:t xml:space="preserve">Decreasing NWD is rare in both sets. The 159 decreasing grid cells (3.3%) are spread across the Mountain (51), West (50), Midwest/Great Lakes (36), Plains (12), South/Southeast (7), and Northeast (3) regions rather than concentrated in any one of them, and most are classified as decreasing because of wetting without warming (98 cells) or browning alone (52 cells). MS captures this group with four sites (CP00 and RN01 at Santa Barbara, LowerJaramillo at Catalina-Jemez, and TECR from NEON), all of which are classified as decreasing solely because of browning; the wetting-driven decreases seen on the grid are not represented in MS.</w:t>
+        <w:t xml:space="preserve">Decreasing NWD is rare in both sets. The 159 decreasing grid cells (3.3%) are spread across the Mountain (51), West (50), Midwest/Great Lakes (36), Plains (12), South/Southeast (7), and Northeast (3) regions rather than concentrated in any one of them, and most are classified as decreasing because of wetting without warming (98 cells) or browning alone (52 cells). MS captures this group with four sites (CP00 and RN01 at Santa Barbara, LowerJaramillo at Catalina-Jemez, and TECR from the National Ecological Observatory Network, NEON), all of which are classified as decreasing solely because of browning; the wetting-driven decreases seen on the grid are not represented in MS.</w:t>
       </w:r>
     </w:p>
     <w:bookmarkEnd w:id="37"/>

</xml_diff>